<commit_message>
docs: add Database Architecture and ERD section to report generator and Word doc
</commit_message>
<xml_diff>
--- a/StudentID_Exam2.docx
+++ b/StudentID_Exam2.docx
@@ -220,6 +220,392 @@
       </w:r>
       <w:r>
         <w:t xml:space="preserve">React Context API (AuthContext) with session persistence, React Navigation (Auth Stack vs App Tabs &amp; Stack).</w:t>
+      </w:r>
+    </w:p>
+    <w:p>
+      <w:pPr>
+        <w:pStyle w:val="Heading2"/>
+        <w:spacing w:after="120" w:before="180"/>
+      </w:pPr>
+      <w:r>
+        <w:t xml:space="preserve">1.2 Database Architecture &amp; Entity Relationship Diagram (ERD)</w:t>
+      </w:r>
+    </w:p>
+    <w:p>
+      <w:pPr>
+        <w:spacing w:after="120"/>
+      </w:pPr>
+      <w:r>
+        <w:t xml:space="preserve">The backend is architected on Cloud Firestore (NoSQL Document Store). The schema balances relational integrity with document denormalization to deliver instant queries without composite indexing bottlenecks:</w:t>
+      </w:r>
+    </w:p>
+    <w:tbl>
+      <w:tblPr>
+        <w:tblW w:type="pct" w:w="5000"/>
+        <w:tblBorders>
+          <w:top w:val="single" w:color="auto" w:sz="4"/>
+          <w:left w:val="single" w:color="auto" w:sz="4"/>
+          <w:bottom w:val="single" w:color="auto" w:sz="4"/>
+          <w:right w:val="single" w:color="auto" w:sz="4"/>
+          <w:insideH w:val="single" w:color="auto" w:sz="4"/>
+          <w:insideV w:val="single" w:color="auto" w:sz="4"/>
+        </w:tblBorders>
+      </w:tblPr>
+      <w:tblGrid>
+        <w:gridCol w:w="2257"/>
+        <w:gridCol w:w="2257"/>
+        <w:gridCol w:w="2257"/>
+        <w:gridCol w:w="2257"/>
+      </w:tblGrid>
+      <w:tr>
+        <w:tc>
+          <w:tcPr>
+            <w:shd w:fill="FFEAD9" w:val="clear"/>
+          </w:tcPr>
+          <w:p>
+            <w:r>
+              <w:rPr>
+                <w:b/>
+                <w:bCs/>
+              </w:rPr>
+              <w:t xml:space="preserve">Collection</w:t>
+            </w:r>
+          </w:p>
+        </w:tc>
+        <w:tc>
+          <w:tcPr>
+            <w:shd w:fill="FFEAD9" w:val="clear"/>
+          </w:tcPr>
+          <w:p>
+            <w:r>
+              <w:rPr>
+                <w:b/>
+                <w:bCs/>
+              </w:rPr>
+              <w:t xml:space="preserve">Document ID</w:t>
+            </w:r>
+          </w:p>
+        </w:tc>
+        <w:tc>
+          <w:tcPr>
+            <w:shd w:fill="FFEAD9" w:val="clear"/>
+          </w:tcPr>
+          <w:p>
+            <w:r>
+              <w:rPr>
+                <w:b/>
+                <w:bCs/>
+              </w:rPr>
+              <w:t xml:space="preserve">Key Fields &amp; Types</w:t>
+            </w:r>
+          </w:p>
+        </w:tc>
+        <w:tc>
+          <w:tcPr>
+            <w:shd w:fill="FFEAD9" w:val="clear"/>
+          </w:tcPr>
+          <w:p>
+            <w:r>
+              <w:rPr>
+                <w:b/>
+                <w:bCs/>
+              </w:rPr>
+              <w:t xml:space="preserve">Role &amp; Description</w:t>
+            </w:r>
+          </w:p>
+        </w:tc>
+      </w:tr>
+      <w:tr>
+        <w:tc>
+          <w:p>
+            <w:r>
+              <w:t xml:space="preserve">users</w:t>
+            </w:r>
+            <w:r>
+              <w:rPr>
+                <w:b/>
+                <w:bCs/>
+              </w:rPr>
+              <w:t xml:space="preserve"> (Root)</w:t>
+            </w:r>
+          </w:p>
+        </w:tc>
+        <w:tc>
+          <w:p>
+            <w:r>
+              <w:t xml:space="preserve">uid (Firebase Auth)</w:t>
+            </w:r>
+          </w:p>
+        </w:tc>
+        <w:tc>
+          <w:p>
+            <w:r>
+              <w:t xml:space="preserve">id: string
+name: string
+email: string
+avatarUrl: string | null
+createdAt: number</w:t>
+            </w:r>
+          </w:p>
+        </w:tc>
+        <w:tc>
+          <w:p>
+            <w:r>
+              <w:t xml:space="preserve">Stores user profiles linked 1:1 with Firebase Authentication accounts.</w:t>
+            </w:r>
+          </w:p>
+        </w:tc>
+      </w:tr>
+      <w:tr>
+        <w:tc>
+          <w:p>
+            <w:r>
+              <w:t xml:space="preserve">teams</w:t>
+            </w:r>
+            <w:r>
+              <w:rPr>
+                <w:b/>
+                <w:bCs/>
+              </w:rPr>
+              <w:t xml:space="preserve"> (Root)</w:t>
+            </w:r>
+          </w:p>
+        </w:tc>
+        <w:tc>
+          <w:p>
+            <w:r>
+              <w:t xml:space="preserve">Auto-generated</w:t>
+            </w:r>
+          </w:p>
+        </w:tc>
+        <w:tc>
+          <w:p>
+            <w:r>
+              <w:t xml:space="preserve">id: string
+code: string (e.g. TF-XXXX)
+name: string
+description: string
+ownerId: string (FK)
+createdAt: number</w:t>
+            </w:r>
+          </w:p>
+        </w:tc>
+        <w:tc>
+          <w:p>
+            <w:r>
+              <w:t xml:space="preserve">Defines team spaces with short 6-char joining codes and owner tracking.</w:t>
+            </w:r>
+          </w:p>
+        </w:tc>
+      </w:tr>
+      <w:tr>
+        <w:tc>
+          <w:p>
+            <w:r>
+              <w:t xml:space="preserve">teamMembers</w:t>
+            </w:r>
+            <w:r>
+              <w:rPr>
+                <w:b/>
+                <w:bCs/>
+              </w:rPr>
+              <w:t xml:space="preserve"> (Root)</w:t>
+            </w:r>
+          </w:p>
+        </w:tc>
+        <w:tc>
+          <w:p>
+            <w:r>
+              <w:t xml:space="preserve">{teamId}_{userId}</w:t>
+            </w:r>
+          </w:p>
+        </w:tc>
+        <w:tc>
+          <w:p>
+            <w:r>
+              <w:t xml:space="preserve">id: string
+teamId: string (FK)
+userId: string (FK)
+userName: string
+userEmail: string
+role: 'owner' | 'member'
+joinedAt: number</w:t>
+            </w:r>
+          </w:p>
+        </w:tc>
+        <w:tc>
+          <w:p>
+            <w:r>
+              <w:t xml:space="preserve">Resolves the Many-to-Many (N:N) relationship between Users and Teams.</w:t>
+            </w:r>
+          </w:p>
+        </w:tc>
+      </w:tr>
+      <w:tr>
+        <w:tc>
+          <w:p>
+            <w:r>
+              <w:t xml:space="preserve">tasks</w:t>
+            </w:r>
+            <w:r>
+              <w:rPr>
+                <w:b/>
+                <w:bCs/>
+              </w:rPr>
+              <w:t xml:space="preserve"> (Root)</w:t>
+            </w:r>
+          </w:p>
+        </w:tc>
+        <w:tc>
+          <w:p>
+            <w:r>
+              <w:t xml:space="preserve">Auto-generated</w:t>
+            </w:r>
+          </w:p>
+        </w:tc>
+        <w:tc>
+          <w:p>
+            <w:r>
+              <w:t xml:space="preserve">id: string
+title: string
+description: string
+status: TaskStatus
+priority: TaskPriority
+dueDate: string (ISO)
+createdAt: number
+creatorId: string (FK)
+teamId: string | null (FK)
+teamName: string | null
+assigneeId: string | null (FK)
+assigneeName: string | null</w:t>
+            </w:r>
+          </w:p>
+        </w:tc>
+        <w:tc>
+          <w:p>
+            <w:r>
+              <w:t xml:space="preserve">Stores tasks. Supports personal tasks (creatorId) and team tasks with member assignee.</w:t>
+            </w:r>
+          </w:p>
+        </w:tc>
+      </w:tr>
+      <w:tr>
+        <w:tc>
+          <w:p>
+            <w:r>
+              <w:t xml:space="preserve">messages</w:t>
+            </w:r>
+            <w:r>
+              <w:rPr>
+                <w:b/>
+                <w:bCs/>
+                <w:sz w:val="18"/>
+                <w:szCs w:val="18"/>
+              </w:rPr>
+              <w:t xml:space="preserve"> (Subcollection)
+teams/{teamId}/messages</w:t>
+            </w:r>
+          </w:p>
+        </w:tc>
+        <w:tc>
+          <w:p>
+            <w:r>
+              <w:t xml:space="preserve">Auto-generated</w:t>
+            </w:r>
+          </w:p>
+        </w:tc>
+        <w:tc>
+          <w:p>
+            <w:r>
+              <w:t xml:space="preserve">id: string
+senderId: string (FK)
+senderName: string
+text: string
+createdAt: number</w:t>
+            </w:r>
+          </w:p>
+        </w:tc>
+        <w:tc>
+          <w:p>
+            <w:r>
+              <w:t xml:space="preserve">Per-team real-time chat messages ordered chronologically via onSnapshot.</w:t>
+            </w:r>
+          </w:p>
+        </w:tc>
+      </w:tr>
+    </w:tbl>
+    <w:p>
+      <w:pPr>
+        <w:spacing w:after="120"/>
+      </w:pPr>
+    </w:p>
+    <w:p>
+      <w:pPr>
+        <w:pStyle w:val="Heading3"/>
+        <w:spacing w:after="80" w:before="120"/>
+      </w:pPr>
+      <w:r>
+        <w:t xml:space="preserve">Entity Relationships (ERD Cardinality):</w:t>
+      </w:r>
+    </w:p>
+    <w:p>
+      <w:pPr>
+        <w:spacing w:after="60"/>
+      </w:pPr>
+      <w:r>
+        <w:rPr>
+          <w:b/>
+          <w:bCs/>
+        </w:rPr>
+        <w:t xml:space="preserve">1. Users &lt;-&gt; Teams (Many-to-Many via teamMembers): </w:t>
+      </w:r>
+      <w:r>
+        <w:t xml:space="preserve">A user can create or join multiple teams. A team has many members with roles (Owner / Member).</w:t>
+      </w:r>
+    </w:p>
+    <w:p>
+      <w:pPr>
+        <w:spacing w:after="60"/>
+      </w:pPr>
+      <w:r>
+        <w:rPr>
+          <w:b/>
+          <w:bCs/>
+        </w:rPr>
+        <w:t xml:space="preserve">2. Teams -&gt; Tasks (One-to-Many): </w:t>
+      </w:r>
+      <w:r>
+        <w:t xml:space="preserve">A team contains multiple tasks. Each team task belongs to exactly one team.</w:t>
+      </w:r>
+    </w:p>
+    <w:p>
+      <w:pPr>
+        <w:spacing w:after="60"/>
+      </w:pPr>
+      <w:r>
+        <w:rPr>
+          <w:b/>
+          <w:bCs/>
+        </w:rPr>
+        <w:t xml:space="preserve">3. Users -&gt; Tasks (One-to-Many for Assignee &amp; Creator): </w:t>
+      </w:r>
+      <w:r>
+        <w:t xml:space="preserve">A team member can be assigned multiple tasks (assigneeId). A user owns their personal tasks (creatorId).</w:t>
+      </w:r>
+    </w:p>
+    <w:p>
+      <w:pPr>
+        <w:spacing w:after="180"/>
+      </w:pPr>
+      <w:r>
+        <w:rPr>
+          <w:b/>
+          <w:bCs/>
+        </w:rPr>
+        <w:t xml:space="preserve">4. Teams -&gt; Messages (One-to-Many subcollection): </w:t>
+      </w:r>
+      <w:r>
+        <w:t xml:space="preserve">Each team manages an independent chat stream under teams/{teamId}/messages.</w:t>
       </w:r>
     </w:p>
     <w:p>

</xml_diff>